<commit_message>
Docs: las observaciones del revisor se atribuyen al cliente (SEVENS)
Se quita el nombre del revisor técnico de los entregables y de docs/flujos.md
por pedido del equipo; sus observaciones figuran como del cliente.

Co-Authored-By: Claude Opus 5.5 <noreply@anthropic.com>
Claude-Session: https://claude.ai/code/session_01PtGmXDVgEBa1Hp6paBTjbG
</commit_message>
<xml_diff>
--- a/entregables/SIGRO - Fichas de cambio de requisitos.docx
+++ b/entregables/SIGRO - Fichas de cambio de requisitos.docx
@@ -685,7 +685,7 @@
                 <w:sz w:val="19"/>
                 <w:szCs w:val="19"/>
               </w:rPr>
-              <w:t xml:space="preserve">Ing. Junior Cercado, revisor técnico, a partir de la práctica del cliente</w:t>
+              <w:t xml:space="preserve">Cliente (SEVENS INGENIEROS SAC), a partir de su práctica en obra</w:t>
             </w:r>
           </w:p>
         </w:tc>
@@ -1151,7 +1151,7 @@
                 <w:sz w:val="19"/>
                 <w:szCs w:val="19"/>
               </w:rPr>
-              <w:t xml:space="preserve">Ing. Junior Cercado, revisor técnico</w:t>
+              <w:t xml:space="preserve">Cliente (SEVENS INGENIEROS SAC)</w:t>
             </w:r>
           </w:p>
         </w:tc>

</xml_diff>